<commit_message>
Remove ServiceLink from all deliverables (whitepaper, deck, data dictionary, PDFs)
</commit_message>
<xml_diff>
--- a/deliverables/GSE_Foreclosure_Whitepaper.docx
+++ b/deliverables/GSE_Foreclosure_Whitepaper.docx
@@ -68,7 +68,7 @@
           <w:sz w:val="22"/>
           <w:szCs w:val="22"/>
         </w:rPr>
-        <w:t xml:space="preserve">Prepared for ServiceLink</w:t>
+        <w:t/>
       </w:r>
     </w:p>
     <w:p>
@@ -267,7 +267,7 @@
           <w:sz w:val="22"/>
           <w:szCs w:val="22"/>
         </w:rPr>
-        <w:t xml:space="preserve">Three findings that should drive ServiceLink decisions</w:t>
+        <w:t>Three findings that should drive decisions</w:t>
       </w:r>
     </w:p>
     <w:p>
@@ -422,7 +422,7 @@
           <w:sz w:val="22"/>
           <w:szCs w:val="22"/>
         </w:rPr>
-        <w:t xml:space="preserve">Stop optimizing judicial-classification routing. Indirect tests suggest online-vs-offline venue likewise has minimal causal impact, though a definitive test requires ServiceLink-internal venue data. Redirect routing-strategy effort toward expanding BPO and property-condition data assets.</w:t>
+        <w:t xml:space="preserve">Stop optimizing judicial-classification routing. Indirect tests suggest online-vs-offline venue likewise has minimal causal impact, though a definitive test requires the servicer-internal venue data. Redirect routing-strategy effort toward expanding BPO and property-condition data assets.</w:t>
       </w:r>
     </w:p>
     <w:p>
@@ -581,7 +581,7 @@
           <w:sz w:val="22"/>
           <w:szCs w:val="22"/>
         </w:rPr>
-        <w:t xml:space="preserve"> depending on geography and time-to-resale. ServiceLink, as a major foreclosure-services provider for GSE-related dispositions, both pays these costs (where contractually responsible) and absorbs the operational complexity of REO management. A reliable forward-looking signal of which dispositions will revert provides material economic and operational leverage.</w:t>
+        <w:t xml:space="preserve"> depending on geography and time-to-resale. the servicer, as a major foreclosure-services provider for GSE-related dispositions, both pays these costs (where contractually responsible) and absorbs the operational complexity of REO management. A reliable forward-looking signal of which dispositions will revert provides material economic and operational leverage.</w:t>
       </w:r>
     </w:p>
     <w:p>
@@ -1433,7 +1433,7 @@
           <w:sz w:val="22"/>
           <w:szCs w:val="22"/>
         </w:rPr>
-        <w:t xml:space="preserve">, clipped to a 0.5×–3× range to suppress extreme HPI ratios. A real broker price opinion would include property-condition signals (deferred maintenance, occupancy state, comparable sale recency) that no public dataset captures. ServiceLink's internal BPO records would be the highest-value next integration.</w:t>
+        <w:t xml:space="preserve">, clipped to a 0.5×–3× range to suppress extreme HPI ratios. A real broker price opinion would include property-condition signals (deferred maintenance, occupancy state, comparable sale recency) that no public dataset captures. the servicer's internal BPO records would be the highest-value next integration.</w:t>
       </w:r>
     </w:p>
     <w:p>
@@ -7339,7 +7339,7 @@
           <w:sz w:val="22"/>
           <w:szCs w:val="22"/>
         </w:rPr>
-        <w:t xml:space="preserve">. Freddie loans tend to have richer field coverage (DTI, occupancy, MSA) which the model exploits. This argues for either separate models per source or, more practically, for ServiceLink to advocate for richer servicer field reporting.</w:t>
+        <w:t xml:space="preserve">. Freddie loans tend to have richer field coverage (DTI, occupancy, MSA) which the model exploits. This argues for either separate models per source or, more practically, for the servicer to advocate for richer servicer field reporting.</w:t>
       </w:r>
     </w:p>
     <w:p>
@@ -9399,7 +9399,7 @@
           <w:sz w:val="22"/>
           <w:szCs w:val="22"/>
         </w:rPr>
-        <w:t xml:space="preserve"> the disposition outcome. Operationally, ServiceLink could use these as forward indicators of REO-rate spikes — when leading indicators turn negative, increase capacity and bottom-decile triage staffing.</w:t>
+        <w:t xml:space="preserve"> the disposition outcome. Operationally, the servicer could use these as forward indicators of REO-rate spikes — when leading indicators turn negative, increase capacity and bottom-decile triage staffing.</w:t>
       </w:r>
     </w:p>
     <w:p>
@@ -9789,7 +9789,7 @@
           <w:sz w:val="22"/>
           <w:szCs w:val="22"/>
         </w:rPr>
-        <w:t xml:space="preserve">ServiceLink would need to integrate its own auction-venue records with our model and rerun the counterfactual experiment. With venue-level data joined to disposition outcomes, a clean test takes 4-6 weeks. This is the highest-leverage data integration on the roadmap (along with internal BPOs).</w:t>
+        <w:t>the servicer would need to integrate their auction-venue records with the model and rerun the counterfactual experiment. With venue-level data joined to disposition outcomes, a clean test takes 4-6 weeks. This is the highest-leverage data integration on the roadmap (along with internal BPOs).</w:t>
       </w:r>
     </w:p>
     <w:tbl>
@@ -10604,7 +10604,7 @@
           <w:sz w:val="22"/>
           <w:szCs w:val="22"/>
         </w:rPr>
-        <w:t xml:space="preserve">The dollar-impact analysis uses public-data benchmarks for cost framing. ServiceLink should substitute internal numbers for production planning.</w:t>
+        <w:t>The dollar-impact analysis uses public-data benchmarks for cost framing. Replace with internal numbers for production planning.</w:t>
       </w:r>
     </w:p>
     <w:p>
@@ -10962,7 +10962,7 @@
                 <w:sz w:val="20"/>
                 <w:szCs w:val="20"/>
               </w:rPr>
-              <w:t xml:space="preserve">ServiceLink GSE share (assumed)</w:t>
+              <w:t>Servicer GSE share (assumed)</w:t>
             </w:r>
           </w:p>
         </w:tc>
@@ -11055,7 +11055,7 @@
                 <w:sz w:val="20"/>
                 <w:szCs w:val="20"/>
               </w:rPr>
-              <w:t xml:space="preserve">Implied ServiceLink annual volume</w:t>
+              <w:t>Implied annual servicer volume</w:t>
             </w:r>
           </w:p>
         </w:tc>
@@ -12605,7 +12605,7 @@
           <w:sz w:val="22"/>
           <w:szCs w:val="22"/>
         </w:rPr>
-        <w:t xml:space="preserve">. These figures rest on assumptions (REO holding cost, market share, intervention effectiveness) that ServiceLink should validate internally before committing to a deployment plan.</w:t>
+        <w:t xml:space="preserve">. These figures rest on assumptions (REO holding cost, market share, intervention effectiveness) that the servicer should validate internally before committing to a deployment plan.</w:t>
       </w:r>
     </w:p>
     <w:p>
@@ -12831,7 +12831,7 @@
           <w:sz w:val="22"/>
           <w:szCs w:val="22"/>
         </w:rPr>
-        <w:t xml:space="preserve">The judicial vs non-judicial gap is 0.4pp and the counterfactual confirms it is non-causal. Capacity that is currently allocated to judicial-strategy decisions can be redirected to intervention work in the bottom deciles, where the data actually point to operational lift. Note that this finding is about the legal classification, not about online vs offline auction venue (Section 5.6) — the latter requires ServiceLink internal data to test definitively.</w:t>
+        <w:t xml:space="preserve">The judicial vs non-judicial gap is 0.4pp and the counterfactual confirms it is non-causal. Capacity that is currently allocated to judicial-strategy decisions can be redirected to intervention work in the bottom deciles, where the data actually point to operational lift. Note that this finding is about the legal classification, not about online vs offline auction venue (Section 5.6) — the latter requires the servicer internal data to test definitively.</w:t>
       </w:r>
     </w:p>
     <w:p>
@@ -13047,7 +13047,7 @@
           <w:sz w:val="22"/>
           <w:szCs w:val="22"/>
         </w:rPr>
-        <w:t xml:space="preserve">GSE data publishes only the first 3 digits of ZIP. Neighborhood-scale features (Census ACS, Zillow ZHVI, ZORI) are aggregated to the ZIP3 level by mean. A ZIP3 like "902" includes Beverly Hills (90210), East LA (90022), and many other neighborhoods with very different dynamics. Neighborhood features are therefore noisier than they would be with full 5-digit ZIP. ServiceLink integration with property-address-level data (where available) would unlock substantially more local signal.</w:t>
+        <w:t xml:space="preserve">GSE data publishes only the first 3 digits of ZIP. Neighborhood-scale features (Census ACS, Zillow ZHVI, ZORI) are aggregated to the ZIP3 level by mean. A ZIP3 like "902" includes Beverly Hills (90210), East LA (90022), and many other neighborhoods with very different dynamics. Neighborhood features are therefore noisier than they would be with full 5-digit ZIP. the servicer integration with property-address-level data (where available) would unlock substantially more local signal.</w:t>
       </w:r>
     </w:p>
     <w:p>
@@ -13306,7 +13306,7 @@
           <w:sz w:val="22"/>
           <w:szCs w:val="22"/>
         </w:rPr>
-        <w:t xml:space="preserve">Replace the $65K REO holding cost, 30% market share, and intervention effectiveness assumptions with ServiceLink's actual financials before committing to a business case.</w:t>
+        <w:t>Replace the $65K REO holding cost, 30% market share, and intervention effectiveness assumptions with actual internal financials before committing to a business case.</w:t>
       </w:r>
     </w:p>
     <w:p>
@@ -13508,7 +13508,7 @@
           <w:sz w:val="22"/>
           <w:szCs w:val="22"/>
         </w:rPr>
-        <w:t xml:space="preserve">Train and deploy parallel models for FHA, VA, and private-label loan pools that ServiceLink touches. Different selection effects, different feature availability, but the same architecture should transfer.</w:t>
+        <w:t>Train and deploy parallel models for FHA, VA, and private-label loan pools that the servicer handles. Different selection effects, different feature availability, but the same architecture should transfer.</w:t>
       </w:r>
     </w:p>
     <w:p>
@@ -13828,7 +13828,7 @@
                 <w:sz w:val="20"/>
                 <w:szCs w:val="20"/>
               </w:rPr>
-              <w:t xml:space="preserve">Pulls new case data from ServiceLink's foreclosure system into the feature schema.</w:t>
+              <w:t>Pulls new case data from the foreclosure management system into the feature schema.</w:t>
             </w:r>
           </w:p>
         </w:tc>
@@ -14509,7 +14509,7 @@
           <w:sz w:val="22"/>
           <w:szCs w:val="22"/>
         </w:rPr>
-        <w:t xml:space="preserve">What ServiceLink needs to make this happen</w:t>
+        <w:t>What you need to make this happen</w:t>
       </w:r>
     </w:p>
     <w:p>
@@ -14703,7 +14703,7 @@
           <w:sz w:val="22"/>
           <w:szCs w:val="22"/>
         </w:rPr>
-        <w:t xml:space="preserve"> use a managed ML platform (Databricks, AWS SageMaker, DataRobot) that handles much of the pipeline plumbing. The choice depends on how strategic ServiceLink considers in-house ML capability versus speed to deployment.</w:t>
+        <w:t xml:space="preserve"> use a managed ML platform (Databricks, AWS SageMaker, DataRobot) that handles much of the pipeline plumbing. The choice depends on how strategic the servicer considers in-house ML capability versus speed to deployment.</w:t>
       </w:r>
     </w:p>
     <w:p>
@@ -14752,7 +14752,7 @@
           <w:sz w:val="22"/>
           <w:szCs w:val="22"/>
         </w:rPr>
-        <w:t xml:space="preserve"> do is forecast 2026 outcomes today in aggregate without macro inputs for 2026 (mortgage rates, unemployment, ZHVI). For aggregate 2026 forecasting, ServiceLink would need to feed the model 2026 macro forecasts and accept the compounded uncertainty of forecasting macro variables one year out. The honest framing for the executive: </w:t>
+        <w:t xml:space="preserve"> do is forecast 2026 outcomes today in aggregate without macro inputs for 2026 (mortgage rates, unemployment, ZHVI). For aggregate 2026 forecasting, the servicer would need to feed the model 2026 macro forecasts and accept the compounded uncertainty of forecasting macro variables one year out. The honest framing for the executive: </w:t>
       </w:r>
       <w:r>
         <w:rPr>
@@ -15858,7 +15858,7 @@
         <w:sz w:val="18"/>
         <w:szCs w:val="18"/>
       </w:rPr>
-      <w:t xml:space="preserve">   |   Prepared for ServiceLink</w:t>
+      <w:t xml:space="preserve">   |   April 2026</w:t>
     </w:r>
   </w:p>
 </w:ftr>

</xml_diff>